<commit_message>
Laboratoire 8 finalisé avec toutes les captures
</commit_message>
<xml_diff>
--- a/lab8/rapport.docx
+++ b/lab8/rapport.docx
@@ -513,7 +513,7 @@
       </w:r>
     </w:p>
     <w:bookmarkEnd w:id="21"/>
-    <w:bookmarkStart w:id="83" w:name="выполнение-лабораторной-работы"/>
+    <w:bookmarkStart w:id="86" w:name="выполнение-лабораторной-работы"/>
     <w:p>
       <w:pPr>
         <w:pStyle w:val="Heading1"/>
@@ -1668,7 +1668,7 @@
       </w:r>
     </w:p>
     <w:bookmarkEnd w:id="63"/>
-    <w:bookmarkStart w:id="67" w:name="изучение-справочных-страниц"/>
+    <w:bookmarkStart w:id="70" w:name="изучение-справочных-страниц"/>
     <w:p>
       <w:pPr>
         <w:pStyle w:val="Heading2"/>
@@ -1781,7 +1781,7 @@
         <w:rPr>
           <w:rStyle w:val="VerbatimChar"/>
         </w:rPr>
-        <w:t xml:space="preserve">man df</w:t>
+        <w:t xml:space="preserve">man du</w:t>
       </w:r>
       <w:r>
         <w:t xml:space="preserve">,</w:t>
@@ -1793,18 +1793,6 @@
         <w:rPr>
           <w:rStyle w:val="VerbatimChar"/>
         </w:rPr>
-        <w:t xml:space="preserve">man du</w:t>
-      </w:r>
-      <w:r>
-        <w:t xml:space="preserve">,</w:t>
-      </w:r>
-      <w:r>
-        <w:t xml:space="preserve"> </w:t>
-      </w:r>
-      <w:r>
-        <w:rPr>
-          <w:rStyle w:val="VerbatimChar"/>
-        </w:rPr>
         <w:t xml:space="preserve">man find</w:t>
       </w:r>
       <w:r>
@@ -1824,66 +1812,6 @@
       </w:r>
       <w:r>
         <w:t xml:space="preserve">):</w:t>
-      </w:r>
-    </w:p>
-    <w:tbl>
-      <w:tblPr>
-        <w:tblStyle w:val="FigureTable"/>
-        <w:tblW w:type="auto" w:w="0"/>
-        <w:jc w:val="center"/>
-        <w:tblLook w:firstRow="0" w:lastRow="0" w:firstColumn="0" w:lastColumn="0"/>
-      </w:tblPr>
-      <w:tblGrid>
-        <w:gridCol w:w="7920"/>
-      </w:tblGrid>
-      <w:tr>
-        <w:tc>
-          <w:tcPr/>
-          <w:p>
-            <w:pPr>
-              <w:pStyle w:val="Compact"/>
-              <w:jc w:val="center"/>
-            </w:pPr>
-            <w:r>
-              <w:t xml:space="preserve">man df</w:t>
-            </w:r>
-          </w:p>
-        </w:tc>
-      </w:tr>
-    </w:tbl>
-    <w:p>
-      <w:pPr>
-        <w:pStyle w:val="ImageCaption"/>
-      </w:pPr>
-      <w:r>
-        <w:t xml:space="preserve">man df</w:t>
-      </w:r>
-    </w:p>
-    <w:bookmarkEnd w:id="67"/>
-    <w:bookmarkStart w:id="74" w:name="анализ-использования-диска"/>
-    <w:p>
-      <w:pPr>
-        <w:pStyle w:val="Heading2"/>
-      </w:pPr>
-      <w:r>
-        <w:t xml:space="preserve">3.8. Анализ использования диска</w:t>
-      </w:r>
-    </w:p>
-    <w:p>
-      <w:pPr>
-        <w:pStyle w:val="FirstParagraph"/>
-      </w:pPr>
-      <w:r>
-        <w:rPr>
-          <w:rStyle w:val="VerbatimChar"/>
-        </w:rPr>
-        <w:t xml:space="preserve">df -h</w:t>
-      </w:r>
-      <w:r>
-        <w:t xml:space="preserve"> </w:t>
-      </w:r>
-      <w:r>
-        <w:t xml:space="preserve">показывает размер каждого смонтированного раздела:</w:t>
       </w:r>
     </w:p>
     <w:p>
@@ -1893,20 +1821,102 @@
       <w:r>
         <w:drawing>
           <wp:inline>
-            <wp:extent cx="5334000" cy="1818717"/>
+            <wp:extent cx="4711700" cy="571500"/>
             <wp:effectExtent b="0" l="0" r="0" t="0"/>
-            <wp:docPr descr="df -h" title="" id="69" name="Picture"/>
+            <wp:docPr descr="man df" title="" id="68" name="Picture"/>
             <a:graphic>
               <a:graphicData uri="http://schemas.openxmlformats.org/drawingml/2006/picture">
                 <pic:pic>
                   <pic:nvPicPr>
-                    <pic:cNvPr descr="images/df.png" id="70" name="Picture"/>
+                    <pic:cNvPr descr="images/man_df.png" id="69" name="Picture"/>
                     <pic:cNvPicPr>
                       <a:picLocks noChangeArrowheads="1" noChangeAspect="1"/>
                     </pic:cNvPicPr>
                   </pic:nvPicPr>
                   <pic:blipFill>
-                    <a:blip r:embed="rId68"/>
+                    <a:blip r:embed="rId67"/>
+                    <a:stretch>
+                      <a:fillRect/>
+                    </a:stretch>
+                  </pic:blipFill>
+                  <pic:spPr bwMode="auto">
+                    <a:xfrm>
+                      <a:off x="0" y="0"/>
+                      <a:ext cx="4711700" cy="571500"/>
+                    </a:xfrm>
+                    <a:prstGeom prst="rect">
+                      <a:avLst/>
+                    </a:prstGeom>
+                    <a:noFill/>
+                    <a:ln w="9525">
+                      <a:noFill/>
+                      <a:headEnd/>
+                      <a:tailEnd/>
+                    </a:ln>
+                  </pic:spPr>
+                </pic:pic>
+              </a:graphicData>
+            </a:graphic>
+          </wp:inline>
+        </w:drawing>
+      </w:r>
+    </w:p>
+    <w:p>
+      <w:pPr>
+        <w:pStyle w:val="ImageCaption"/>
+      </w:pPr>
+      <w:r>
+        <w:t xml:space="preserve">man df</w:t>
+      </w:r>
+    </w:p>
+    <w:bookmarkEnd w:id="70"/>
+    <w:bookmarkStart w:id="77" w:name="анализ-использования-диска"/>
+    <w:p>
+      <w:pPr>
+        <w:pStyle w:val="Heading2"/>
+      </w:pPr>
+      <w:r>
+        <w:t xml:space="preserve">3.8. Анализ использования диска</w:t>
+      </w:r>
+    </w:p>
+    <w:p>
+      <w:pPr>
+        <w:pStyle w:val="FirstParagraph"/>
+      </w:pPr>
+      <w:r>
+        <w:rPr>
+          <w:rStyle w:val="VerbatimChar"/>
+        </w:rPr>
+        <w:t xml:space="preserve">df -h</w:t>
+      </w:r>
+      <w:r>
+        <w:t xml:space="preserve"> </w:t>
+      </w:r>
+      <w:r>
+        <w:t xml:space="preserve">показывает размер каждого смонтированного раздела:</w:t>
+      </w:r>
+    </w:p>
+    <w:p>
+      <w:pPr>
+        <w:pStyle w:val="CaptionedFigure"/>
+      </w:pPr>
+      <w:r>
+        <w:drawing>
+          <wp:inline>
+            <wp:extent cx="5334000" cy="1818717"/>
+            <wp:effectExtent b="0" l="0" r="0" t="0"/>
+            <wp:docPr descr="df -h" title="" id="72" name="Picture"/>
+            <a:graphic>
+              <a:graphicData uri="http://schemas.openxmlformats.org/drawingml/2006/picture">
+                <pic:pic>
+                  <pic:nvPicPr>
+                    <pic:cNvPr descr="images/df.png" id="73" name="Picture"/>
+                    <pic:cNvPicPr>
+                      <a:picLocks noChangeArrowheads="1" noChangeAspect="1"/>
+                    </pic:cNvPicPr>
+                  </pic:nvPicPr>
+                  <pic:blipFill>
+                    <a:blip r:embed="rId71"/>
                     <a:stretch>
                       <a:fillRect/>
                     </a:stretch>
@@ -1967,18 +1977,18 @@
           <wp:inline>
             <wp:extent cx="5334000" cy="515968"/>
             <wp:effectExtent b="0" l="0" r="0" t="0"/>
-            <wp:docPr descr="du -sh ~" title="" id="72" name="Picture"/>
+            <wp:docPr descr="du -sh ~" title="" id="75" name="Picture"/>
             <a:graphic>
               <a:graphicData uri="http://schemas.openxmlformats.org/drawingml/2006/picture">
                 <pic:pic>
                   <pic:nvPicPr>
-                    <pic:cNvPr descr="images/du_home.png" id="73" name="Picture"/>
+                    <pic:cNvPr descr="images/du_home.png" id="76" name="Picture"/>
                     <pic:cNvPicPr>
                       <a:picLocks noChangeArrowheads="1" noChangeAspect="1"/>
                     </pic:cNvPicPr>
                   </pic:nvPicPr>
                   <pic:blipFill>
-                    <a:blip r:embed="rId71"/>
+                    <a:blip r:embed="rId74"/>
                     <a:stretch>
                       <a:fillRect/>
                     </a:stretch>
@@ -2013,8 +2023,8 @@
         <w:t xml:space="preserve">du -sh ~</w:t>
       </w:r>
     </w:p>
-    <w:bookmarkEnd w:id="74"/>
-    <w:bookmarkStart w:id="78" w:name="X507d47c0aef4bff0c1ba8294b67e31e40609e72"/>
+    <w:bookmarkEnd w:id="77"/>
+    <w:bookmarkStart w:id="81" w:name="X507d47c0aef4bff0c1ba8294b67e31e40609e72"/>
     <w:p>
       <w:pPr>
         <w:pStyle w:val="Heading2"/>
@@ -2055,18 +2065,18 @@
           <wp:inline>
             <wp:extent cx="5334000" cy="3927987"/>
             <wp:effectExtent b="0" l="0" r="0" t="0"/>
-            <wp:docPr descr="find ~ -type d" title="" id="76" name="Picture"/>
+            <wp:docPr descr="find ~ -type d" title="" id="79" name="Picture"/>
             <a:graphic>
               <a:graphicData uri="http://schemas.openxmlformats.org/drawingml/2006/picture">
                 <pic:pic>
                   <pic:nvPicPr>
-                    <pic:cNvPr descr="images/find_dirs.png" id="77" name="Picture"/>
+                    <pic:cNvPr descr="images/find_dirs.png" id="80" name="Picture"/>
                     <pic:cNvPicPr>
                       <a:picLocks noChangeArrowheads="1" noChangeAspect="1"/>
                     </pic:cNvPicPr>
                   </pic:nvPicPr>
                   <pic:blipFill>
-                    <a:blip r:embed="rId75"/>
+                    <a:blip r:embed="rId78"/>
                     <a:stretch>
                       <a:fillRect/>
                     </a:stretch>
@@ -2101,8 +2111,8 @@
         <w:t xml:space="preserve">find ~ -type d</w:t>
       </w:r>
     </w:p>
-    <w:bookmarkEnd w:id="78"/>
-    <w:bookmarkStart w:id="82" w:name="дополнительно-утилиты-top-и-htop"/>
+    <w:bookmarkEnd w:id="81"/>
+    <w:bookmarkStart w:id="85" w:name="дополнительно-утилиты-top-и-htop"/>
     <w:p>
       <w:pPr>
         <w:pStyle w:val="Heading2"/>
@@ -2161,18 +2171,18 @@
           <wp:inline>
             <wp:extent cx="5334000" cy="3927987"/>
             <wp:effectExtent b="0" l="0" r="0" t="0"/>
-            <wp:docPr descr="top" title="" id="80" name="Picture"/>
+            <wp:docPr descr="top" title="" id="83" name="Picture"/>
             <a:graphic>
               <a:graphicData uri="http://schemas.openxmlformats.org/drawingml/2006/picture">
                 <pic:pic>
                   <pic:nvPicPr>
-                    <pic:cNvPr descr="images/top.png" id="81" name="Picture"/>
+                    <pic:cNvPr descr="images/top.png" id="84" name="Picture"/>
                     <pic:cNvPicPr>
                       <a:picLocks noChangeArrowheads="1" noChangeAspect="1"/>
                     </pic:cNvPicPr>
                   </pic:nvPicPr>
                   <pic:blipFill>
-                    <a:blip r:embed="rId79"/>
+                    <a:blip r:embed="rId82"/>
                     <a:stretch>
                       <a:fillRect/>
                     </a:stretch>
@@ -2207,59 +2217,9 @@
         <w:t xml:space="preserve">top</w:t>
       </w:r>
     </w:p>
-    <w:p>
-      <w:pPr>
-        <w:pStyle w:val="BodyText"/>
-      </w:pPr>
-      <w:r>
-        <w:rPr>
-          <w:rStyle w:val="VerbatimChar"/>
-        </w:rPr>
-        <w:t xml:space="preserve">htop</w:t>
-      </w:r>
-      <w:r>
-        <w:t xml:space="preserve"> </w:t>
-      </w:r>
-      <w:r>
-        <w:t xml:space="preserve">(если установлен) предоставляет более удобный интерфейс:</w:t>
-      </w:r>
-    </w:p>
-    <w:tbl>
-      <w:tblPr>
-        <w:tblStyle w:val="FigureTable"/>
-        <w:tblW w:type="auto" w:w="0"/>
-        <w:jc w:val="center"/>
-        <w:tblLook w:firstRow="0" w:lastRow="0" w:firstColumn="0" w:lastColumn="0"/>
-      </w:tblPr>
-      <w:tblGrid>
-        <w:gridCol w:w="7920"/>
-      </w:tblGrid>
-      <w:tr>
-        <w:tc>
-          <w:tcPr/>
-          <w:p>
-            <w:pPr>
-              <w:pStyle w:val="Compact"/>
-              <w:jc w:val="center"/>
-            </w:pPr>
-            <w:r>
-              <w:t xml:space="preserve">htop</w:t>
-            </w:r>
-          </w:p>
-        </w:tc>
-      </w:tr>
-    </w:tbl>
-    <w:p>
-      <w:pPr>
-        <w:pStyle w:val="ImageCaption"/>
-      </w:pPr>
-      <w:r>
-        <w:t xml:space="preserve">htop</w:t>
-      </w:r>
-    </w:p>
-    <w:bookmarkEnd w:id="82"/>
-    <w:bookmarkEnd w:id="83"/>
-    <w:bookmarkStart w:id="84" w:name="выводы"/>
+    <w:bookmarkEnd w:id="85"/>
+    <w:bookmarkEnd w:id="86"/>
+    <w:bookmarkStart w:id="87" w:name="выводы"/>
     <w:p>
       <w:pPr>
         <w:pStyle w:val="Heading1"/>
@@ -2378,8 +2338,8 @@
         <w:t xml:space="preserve">). Полученные навыки необходимы для эффективной работы в командной строке Linux.</w:t>
       </w:r>
     </w:p>
-    <w:bookmarkEnd w:id="84"/>
-    <w:bookmarkStart w:id="85" w:name="ответы-на-контрольные-вопросы"/>
+    <w:bookmarkEnd w:id="87"/>
+    <w:bookmarkStart w:id="88" w:name="ответы-на-контрольные-вопросы"/>
     <w:p>
       <w:pPr>
         <w:pStyle w:val="Heading1"/>
@@ -2967,8 +2927,8 @@
         <w:t xml:space="preserve">для принудительного завершения.</w:t>
       </w:r>
     </w:p>
-    <w:bookmarkEnd w:id="85"/>
-    <w:bookmarkStart w:id="86" w:name="список-литературы"/>
+    <w:bookmarkEnd w:id="88"/>
+    <w:bookmarkStart w:id="89" w:name="список-литературы"/>
     <w:p>
       <w:pPr>
         <w:pStyle w:val="Heading1"/>
@@ -3094,7 +3054,7 @@
         <w:t xml:space="preserve">Курс «Архитектура компьютеров и операционные системы».</w:t>
       </w:r>
     </w:p>
-    <w:bookmarkEnd w:id="86"/>
+    <w:bookmarkEnd w:id="89"/>
     <w:sectPr/>
   </w:body>
 </w:document>

</xml_diff>